<commit_message>
更新 HSIO Spec 文档
</commit_message>
<xml_diff>
--- a/hsio_spec.docx
+++ b/hsio_spec.docx
@@ -31,7 +31,7 @@
           <w:rFonts w:ascii="Calibri" w:hAnsi="Calibri" w:eastAsia="SimSun" w:cs="Calibri"/>
           <w:sz w:val="21"/>
         </w:rPr>
-        <w:t>：1.29</w:t>
+        <w:t>：1.34</w:t>
       </w:r>
     </w:p>
     <w:p>
@@ -1202,7 +1202,21 @@
           <w:rFonts w:ascii="Calibri" w:hAnsi="Calibri" w:eastAsia="SimSun" w:cs="Calibri"/>
           <w:sz w:val="21"/>
         </w:rPr>
-        <w:t>：支持 MSI/MSI-X；SR-IOV 场景使用 MSI-X。</w:t>
+        <w:t xml:space="preserve">：PF 支持 MSI 和 MSI-X；VF 支持 MSI，VF 是否支持 MSI-X 为 </w:t>
+      </w:r>
+      <w:r>
+        <w:rPr>
+          <w:rFonts w:ascii="Consolas" w:hAnsi="Consolas" w:eastAsia="Consolas" w:cs="Consolas"/>
+          <w:sz w:val="21"/>
+        </w:rPr>
+        <w:t>[TBD]</w:t>
+      </w:r>
+      <w:r>
+        <w:rPr>
+          <w:rFonts w:ascii="Calibri" w:hAnsi="Calibri" w:eastAsia="SimSun" w:cs="Calibri"/>
+          <w:sz w:val="21"/>
+        </w:rPr>
+        <w:t>。</w:t>
       </w:r>
     </w:p>
     <w:p>
@@ -1580,7 +1594,7 @@
           <w:b/>
           <w:sz w:val="21"/>
         </w:rPr>
-        <w:t>ATS/PASID/PRS</w:t>
+        <w:t>ATS/PASID/PRS/TLP Prefix/TPH</w:t>
       </w:r>
       <w:r>
         <w:rPr>
@@ -1692,7 +1706,7 @@
           <w:b/>
           <w:sz w:val="21"/>
         </w:rPr>
-        <w:t>IDE / DPC / eDPC / NPEM / DPA / OBFF / Atomic Operation / TPH / TLP Prefix</w:t>
+        <w:t>IDE / DPC / eDPC / NPEM / DPA / OBFF / Atomic Operation</w:t>
       </w:r>
       <w:r>
         <w:rPr>
@@ -7498,7 +7512,7 @@
                 <w:b/>
                 <w:sz w:val="15"/>
               </w:rPr>
-              <w:t>MSI-X 配置</w:t>
+              <w:t>Interrupt 配置</w:t>
             </w:r>
           </w:p>
         </w:tc>
@@ -7645,7 +7659,14 @@
                 <w:rFonts w:ascii="Calibri" w:hAnsi="Calibri" w:eastAsia="SimSun" w:cs="Calibri"/>
                 <w:sz w:val="15"/>
               </w:rPr>
-              <w:t>PF 16 entries；每 VF 4 entries</w:t>
+              <w:t xml:space="preserve">PF/VF interrupt mode </w:t>
+            </w:r>
+            <w:r>
+              <w:rPr>
+                <w:rFonts w:ascii="Consolas" w:hAnsi="Consolas" w:eastAsia="Consolas" w:cs="Consolas"/>
+                <w:sz w:val="15"/>
+              </w:rPr>
+              <w:t>[TBD]</w:t>
             </w:r>
           </w:p>
         </w:tc>
@@ -7780,7 +7801,14 @@
                 <w:rFonts w:ascii="Calibri" w:hAnsi="Calibri" w:eastAsia="SimSun" w:cs="Calibri"/>
                 <w:sz w:val="15"/>
               </w:rPr>
-              <w:t>PF 8 entries；每 VF 2 entries</w:t>
+              <w:t xml:space="preserve">PF/VF interrupt mode </w:t>
+            </w:r>
+            <w:r>
+              <w:rPr>
+                <w:rFonts w:ascii="Consolas" w:hAnsi="Consolas" w:eastAsia="Consolas" w:cs="Consolas"/>
+                <w:sz w:val="15"/>
+              </w:rPr>
+              <w:t>[TBD]</w:t>
             </w:r>
           </w:p>
         </w:tc>
@@ -7915,7 +7943,14 @@
                 <w:rFonts w:ascii="Calibri" w:hAnsi="Calibri" w:eastAsia="SimSun" w:cs="Calibri"/>
                 <w:sz w:val="15"/>
               </w:rPr>
-              <w:t>PF 4 entries；每 VF 2 entries</w:t>
+              <w:t xml:space="preserve">PF/VF interrupt mode </w:t>
+            </w:r>
+            <w:r>
+              <w:rPr>
+                <w:rFonts w:ascii="Consolas" w:hAnsi="Consolas" w:eastAsia="Consolas" w:cs="Consolas"/>
+                <w:sz w:val="15"/>
+              </w:rPr>
+              <w:t>[TBD]</w:t>
             </w:r>
           </w:p>
         </w:tc>
@@ -8034,6 +8069,32 @@
           <w:sz w:val="21"/>
         </w:rPr>
         <w:t>。X4 profile 的 1 PF + 8 VF 依赖 ARI-capable hierarchy。</w:t>
+      </w:r>
+    </w:p>
+    <w:p>
+      <w:pPr>
+        <w:spacing w:after="120" w:line="300" w:lineRule="auto"/>
+      </w:pPr>
+      <w:r>
+        <w:rPr>
+          <w:rFonts w:ascii="Calibri" w:hAnsi="Calibri" w:eastAsia="SimSun" w:cs="Calibri"/>
+          <w:sz w:val="21"/>
+        </w:rPr>
+        <w:t xml:space="preserve">SR-IOV enable 与 MSI/MSI-X enable 不是同一个功能开关。PF 固定支持 MSI 和 MSI-X；VF 固定支持 MSI，VF 是否支持 MSI-X 为 </w:t>
+      </w:r>
+      <w:r>
+        <w:rPr>
+          <w:rFonts w:ascii="Consolas" w:hAnsi="Consolas" w:eastAsia="Consolas" w:cs="Consolas"/>
+          <w:sz w:val="21"/>
+        </w:rPr>
+        <w:t>[TBD]</w:t>
+      </w:r>
+      <w:r>
+        <w:rPr>
+          <w:rFonts w:ascii="Calibri" w:hAnsi="Calibri" w:eastAsia="SimSun" w:cs="Calibri"/>
+          <w:sz w:val="21"/>
+        </w:rPr>
+        <w:t>。</w:t>
       </w:r>
     </w:p>
     <w:p>
@@ -15997,7 +16058,7 @@
                 <w:rFonts w:ascii="Calibri" w:hAnsi="Calibri" w:eastAsia="SimSun" w:cs="Calibri"/>
                 <w:sz w:val="15"/>
               </w:rPr>
-              <w:t>MSI-X capability</w:t>
+              <w:t>PF MSI capability</w:t>
             </w:r>
           </w:p>
         </w:tc>
@@ -16016,7 +16077,7 @@
                 <w:rFonts w:ascii="Consolas" w:hAnsi="Consolas" w:eastAsia="Consolas" w:cs="Consolas"/>
                 <w:sz w:val="15"/>
               </w:rPr>
-              <w:t>MSIX_CAP_ENABLE</w:t>
+              <w:t>[TBD]</w:t>
             </w:r>
           </w:p>
         </w:tc>
@@ -16092,7 +16153,14 @@
                 <w:rFonts w:ascii="Calibri" w:hAnsi="Calibri" w:eastAsia="SimSun" w:cs="Calibri"/>
                 <w:sz w:val="15"/>
               </w:rPr>
-              <w:t>PF 支持 MSI-X</w:t>
+              <w:t xml:space="preserve">PF 支持 MSI；具体参数名为 </w:t>
+            </w:r>
+            <w:r>
+              <w:rPr>
+                <w:rFonts w:ascii="Consolas" w:hAnsi="Consolas" w:eastAsia="Consolas" w:cs="Consolas"/>
+                <w:sz w:val="15"/>
+              </w:rPr>
+              <w:t>[TBD]</w:t>
             </w:r>
           </w:p>
         </w:tc>
@@ -16113,7 +16181,7 @@
                 <w:rFonts w:ascii="Calibri" w:hAnsi="Calibri" w:eastAsia="SimSun" w:cs="Calibri"/>
                 <w:sz w:val="15"/>
               </w:rPr>
-              <w:t>Integrated MSI-X</w:t>
+              <w:t>PF MSI-X capability</w:t>
             </w:r>
           </w:p>
         </w:tc>
@@ -16132,7 +16200,7 @@
                 <w:rFonts w:ascii="Consolas" w:hAnsi="Consolas" w:eastAsia="Consolas" w:cs="Consolas"/>
                 <w:sz w:val="15"/>
               </w:rPr>
-              <w:t>MSIX_TABLE_EN</w:t>
+              <w:t>MSIX_CAP_ENABLE</w:t>
             </w:r>
           </w:p>
         </w:tc>
@@ -16208,7 +16276,7 @@
                 <w:rFonts w:ascii="Calibri" w:hAnsi="Calibri" w:eastAsia="SimSun" w:cs="Calibri"/>
                 <w:sz w:val="15"/>
               </w:rPr>
-              <w:t>使用 Controller 内部 MSI-X table/PBA</w:t>
+              <w:t>PF 支持 MSI-X</w:t>
             </w:r>
           </w:p>
         </w:tc>
@@ -16229,7 +16297,7 @@
                 <w:rFonts w:ascii="Calibri" w:hAnsi="Calibri" w:eastAsia="SimSun" w:cs="Calibri"/>
                 <w:sz w:val="15"/>
               </w:rPr>
-              <w:t>PF MSI-X table size</w:t>
+              <w:t>Integrated MSI-X</w:t>
             </w:r>
           </w:p>
         </w:tc>
@@ -16248,7 +16316,7 @@
                 <w:rFonts w:ascii="Consolas" w:hAnsi="Consolas" w:eastAsia="Consolas" w:cs="Consolas"/>
                 <w:sz w:val="15"/>
               </w:rPr>
-              <w:t>MSIX_TABLE_SIZE_0</w:t>
+              <w:t>MSIX_TABLE_EN</w:t>
             </w:r>
           </w:p>
         </w:tc>
@@ -16267,7 +16335,7 @@
                 <w:rFonts w:ascii="Calibri" w:hAnsi="Calibri" w:eastAsia="SimSun" w:cs="Calibri"/>
                 <w:sz w:val="15"/>
               </w:rPr>
-              <w:t>15</w:t>
+              <w:t>1</w:t>
             </w:r>
           </w:p>
         </w:tc>
@@ -16286,7 +16354,7 @@
                 <w:rFonts w:ascii="Calibri" w:hAnsi="Calibri" w:eastAsia="SimSun" w:cs="Calibri"/>
                 <w:sz w:val="15"/>
               </w:rPr>
-              <w:t>7</w:t>
+              <w:t>1</w:t>
             </w:r>
           </w:p>
         </w:tc>
@@ -16305,7 +16373,7 @@
                 <w:rFonts w:ascii="Calibri" w:hAnsi="Calibri" w:eastAsia="SimSun" w:cs="Calibri"/>
                 <w:sz w:val="15"/>
               </w:rPr>
-              <w:t>3</w:t>
+              <w:t>1</w:t>
             </w:r>
           </w:p>
         </w:tc>
@@ -16324,7 +16392,14 @@
                 <w:rFonts w:ascii="Calibri" w:hAnsi="Calibri" w:eastAsia="SimSun" w:cs="Calibri"/>
                 <w:sz w:val="15"/>
               </w:rPr>
-              <w:t>字段值为 PF entry 数 - 1</w:t>
+              <w:t xml:space="preserve">PF MSI-X table/PBA 使用 Controller 内部实现；VF MSI-X 是否使用该机制为 </w:t>
+            </w:r>
+            <w:r>
+              <w:rPr>
+                <w:rFonts w:ascii="Consolas" w:hAnsi="Consolas" w:eastAsia="Consolas" w:cs="Consolas"/>
+                <w:sz w:val="15"/>
+              </w:rPr>
+              <w:t>[TBD]</w:t>
             </w:r>
           </w:p>
         </w:tc>
@@ -16345,7 +16420,7 @@
                 <w:rFonts w:ascii="Calibri" w:hAnsi="Calibri" w:eastAsia="SimSun" w:cs="Calibri"/>
                 <w:sz w:val="15"/>
               </w:rPr>
-              <w:t>VF MSI-X capability</w:t>
+              <w:t>PF MSI-X table size</w:t>
             </w:r>
           </w:p>
         </w:tc>
@@ -16364,7 +16439,7 @@
                 <w:rFonts w:ascii="Consolas" w:hAnsi="Consolas" w:eastAsia="Consolas" w:cs="Consolas"/>
                 <w:sz w:val="15"/>
               </w:rPr>
-              <w:t>VF_MSIX_CAP_ENABLE</w:t>
+              <w:t>MSIX_TABLE_SIZE_0</w:t>
             </w:r>
           </w:p>
         </w:tc>
@@ -16380,10 +16455,10 @@
             <w:r/>
             <w:r>
               <w:rPr>
-                <w:rFonts w:ascii="Calibri" w:hAnsi="Calibri" w:eastAsia="SimSun" w:cs="Calibri"/>
-                <w:sz w:val="15"/>
-              </w:rPr>
-              <w:t>1</w:t>
+                <w:rFonts w:ascii="Consolas" w:hAnsi="Consolas" w:eastAsia="Consolas" w:cs="Consolas"/>
+                <w:sz w:val="15"/>
+              </w:rPr>
+              <w:t>[TBD]</w:t>
             </w:r>
           </w:p>
         </w:tc>
@@ -16399,10 +16474,10 @@
             <w:r/>
             <w:r>
               <w:rPr>
-                <w:rFonts w:ascii="Calibri" w:hAnsi="Calibri" w:eastAsia="SimSun" w:cs="Calibri"/>
-                <w:sz w:val="15"/>
-              </w:rPr>
-              <w:t>1</w:t>
+                <w:rFonts w:ascii="Consolas" w:hAnsi="Consolas" w:eastAsia="Consolas" w:cs="Consolas"/>
+                <w:sz w:val="15"/>
+              </w:rPr>
+              <w:t>[TBD]</w:t>
             </w:r>
           </w:p>
         </w:tc>
@@ -16418,10 +16493,10 @@
             <w:r/>
             <w:r>
               <w:rPr>
-                <w:rFonts w:ascii="Calibri" w:hAnsi="Calibri" w:eastAsia="SimSun" w:cs="Calibri"/>
-                <w:sz w:val="15"/>
-              </w:rPr>
-              <w:t>1</w:t>
+                <w:rFonts w:ascii="Consolas" w:hAnsi="Consolas" w:eastAsia="Consolas" w:cs="Consolas"/>
+                <w:sz w:val="15"/>
+              </w:rPr>
+              <w:t>[TBD]</w:t>
             </w:r>
           </w:p>
         </w:tc>
@@ -16440,7 +16515,7 @@
                 <w:rFonts w:ascii="Calibri" w:hAnsi="Calibri" w:eastAsia="SimSun" w:cs="Calibri"/>
                 <w:sz w:val="15"/>
               </w:rPr>
-              <w:t>VF 支持 MSI-X</w:t>
+              <w:t>PF MSI-X entry 数由 PF interrupt vector 规划决定</w:t>
             </w:r>
           </w:p>
         </w:tc>
@@ -16461,6 +16536,245 @@
                 <w:rFonts w:ascii="Calibri" w:hAnsi="Calibri" w:eastAsia="SimSun" w:cs="Calibri"/>
                 <w:sz w:val="15"/>
               </w:rPr>
+              <w:t>VF MSI capability</w:t>
+            </w:r>
+          </w:p>
+        </w:tc>
+        <w:tc>
+          <w:tcPr>
+            <w:tcW w:type="dxa" w:w="3214"/>
+            <w:vAlign w:val="center"/>
+          </w:tcPr>
+          <w:p>
+            <w:pPr>
+              <w:spacing w:after="0" w:line="240" w:lineRule="auto"/>
+            </w:pPr>
+            <w:r/>
+            <w:r>
+              <w:rPr>
+                <w:rFonts w:ascii="Consolas" w:hAnsi="Consolas" w:eastAsia="Consolas" w:cs="Consolas"/>
+                <w:sz w:val="15"/>
+              </w:rPr>
+              <w:t>VF_MSI_CAP_ENABLE</w:t>
+            </w:r>
+          </w:p>
+        </w:tc>
+        <w:tc>
+          <w:tcPr>
+            <w:tcW w:type="dxa" w:w="1692"/>
+            <w:vAlign w:val="center"/>
+          </w:tcPr>
+          <w:p>
+            <w:pPr>
+              <w:spacing w:after="0" w:line="240" w:lineRule="auto"/>
+            </w:pPr>
+            <w:r/>
+            <w:r>
+              <w:rPr>
+                <w:rFonts w:ascii="Calibri" w:hAnsi="Calibri" w:eastAsia="SimSun" w:cs="Calibri"/>
+                <w:sz w:val="15"/>
+              </w:rPr>
+              <w:t>1</w:t>
+            </w:r>
+          </w:p>
+        </w:tc>
+        <w:tc>
+          <w:tcPr>
+            <w:tcW w:type="dxa" w:w="1692"/>
+            <w:vAlign w:val="center"/>
+          </w:tcPr>
+          <w:p>
+            <w:pPr>
+              <w:spacing w:after="0" w:line="240" w:lineRule="auto"/>
+            </w:pPr>
+            <w:r/>
+            <w:r>
+              <w:rPr>
+                <w:rFonts w:ascii="Calibri" w:hAnsi="Calibri" w:eastAsia="SimSun" w:cs="Calibri"/>
+                <w:sz w:val="15"/>
+              </w:rPr>
+              <w:t>1</w:t>
+            </w:r>
+          </w:p>
+        </w:tc>
+        <w:tc>
+          <w:tcPr>
+            <w:tcW w:type="dxa" w:w="1692"/>
+            <w:vAlign w:val="center"/>
+          </w:tcPr>
+          <w:p>
+            <w:pPr>
+              <w:spacing w:after="0" w:line="240" w:lineRule="auto"/>
+            </w:pPr>
+            <w:r/>
+            <w:r>
+              <w:rPr>
+                <w:rFonts w:ascii="Calibri" w:hAnsi="Calibri" w:eastAsia="SimSun" w:cs="Calibri"/>
+                <w:sz w:val="15"/>
+              </w:rPr>
+              <w:t>1</w:t>
+            </w:r>
+          </w:p>
+        </w:tc>
+        <w:tc>
+          <w:tcPr>
+            <w:tcW w:type="dxa" w:w="3554"/>
+            <w:vAlign w:val="center"/>
+          </w:tcPr>
+          <w:p>
+            <w:pPr>
+              <w:spacing w:after="0" w:line="240" w:lineRule="auto"/>
+            </w:pPr>
+            <w:r/>
+            <w:r>
+              <w:rPr>
+                <w:rFonts w:ascii="Calibri" w:hAnsi="Calibri" w:eastAsia="SimSun" w:cs="Calibri"/>
+                <w:sz w:val="15"/>
+              </w:rPr>
+              <w:t>VF 支持 MSI</w:t>
+            </w:r>
+          </w:p>
+        </w:tc>
+      </w:tr>
+      <w:tr>
+        <w:tc>
+          <w:tcPr>
+            <w:tcW w:type="dxa" w:w="1692"/>
+            <w:vAlign w:val="center"/>
+          </w:tcPr>
+          <w:p>
+            <w:pPr>
+              <w:spacing w:after="0" w:line="240" w:lineRule="auto"/>
+            </w:pPr>
+            <w:r/>
+            <w:r>
+              <w:rPr>
+                <w:rFonts w:ascii="Calibri" w:hAnsi="Calibri" w:eastAsia="SimSun" w:cs="Calibri"/>
+                <w:sz w:val="15"/>
+              </w:rPr>
+              <w:t>VF MSI-X capability</w:t>
+            </w:r>
+          </w:p>
+        </w:tc>
+        <w:tc>
+          <w:tcPr>
+            <w:tcW w:type="dxa" w:w="3214"/>
+            <w:vAlign w:val="center"/>
+          </w:tcPr>
+          <w:p>
+            <w:pPr>
+              <w:spacing w:after="0" w:line="240" w:lineRule="auto"/>
+            </w:pPr>
+            <w:r/>
+            <w:r>
+              <w:rPr>
+                <w:rFonts w:ascii="Consolas" w:hAnsi="Consolas" w:eastAsia="Consolas" w:cs="Consolas"/>
+                <w:sz w:val="15"/>
+              </w:rPr>
+              <w:t>VF_MSIX_CAP_ENABLE</w:t>
+            </w:r>
+          </w:p>
+        </w:tc>
+        <w:tc>
+          <w:tcPr>
+            <w:tcW w:type="dxa" w:w="1692"/>
+            <w:vAlign w:val="center"/>
+          </w:tcPr>
+          <w:p>
+            <w:pPr>
+              <w:spacing w:after="0" w:line="240" w:lineRule="auto"/>
+            </w:pPr>
+            <w:r/>
+            <w:r>
+              <w:rPr>
+                <w:rFonts w:ascii="Consolas" w:hAnsi="Consolas" w:eastAsia="Consolas" w:cs="Consolas"/>
+                <w:sz w:val="15"/>
+              </w:rPr>
+              <w:t>[TBD]</w:t>
+            </w:r>
+          </w:p>
+        </w:tc>
+        <w:tc>
+          <w:tcPr>
+            <w:tcW w:type="dxa" w:w="1692"/>
+            <w:vAlign w:val="center"/>
+          </w:tcPr>
+          <w:p>
+            <w:pPr>
+              <w:spacing w:after="0" w:line="240" w:lineRule="auto"/>
+            </w:pPr>
+            <w:r/>
+            <w:r>
+              <w:rPr>
+                <w:rFonts w:ascii="Consolas" w:hAnsi="Consolas" w:eastAsia="Consolas" w:cs="Consolas"/>
+                <w:sz w:val="15"/>
+              </w:rPr>
+              <w:t>[TBD]</w:t>
+            </w:r>
+          </w:p>
+        </w:tc>
+        <w:tc>
+          <w:tcPr>
+            <w:tcW w:type="dxa" w:w="1692"/>
+            <w:vAlign w:val="center"/>
+          </w:tcPr>
+          <w:p>
+            <w:pPr>
+              <w:spacing w:after="0" w:line="240" w:lineRule="auto"/>
+            </w:pPr>
+            <w:r/>
+            <w:r>
+              <w:rPr>
+                <w:rFonts w:ascii="Consolas" w:hAnsi="Consolas" w:eastAsia="Consolas" w:cs="Consolas"/>
+                <w:sz w:val="15"/>
+              </w:rPr>
+              <w:t>[TBD]</w:t>
+            </w:r>
+          </w:p>
+        </w:tc>
+        <w:tc>
+          <w:tcPr>
+            <w:tcW w:type="dxa" w:w="3554"/>
+            <w:vAlign w:val="center"/>
+          </w:tcPr>
+          <w:p>
+            <w:pPr>
+              <w:spacing w:after="0" w:line="240" w:lineRule="auto"/>
+            </w:pPr>
+            <w:r/>
+            <w:r>
+              <w:rPr>
+                <w:rFonts w:ascii="Calibri" w:hAnsi="Calibri" w:eastAsia="SimSun" w:cs="Calibri"/>
+                <w:sz w:val="15"/>
+              </w:rPr>
+              <w:t xml:space="preserve">VF 是否支持 MSI-X 为 </w:t>
+            </w:r>
+            <w:r>
+              <w:rPr>
+                <w:rFonts w:ascii="Consolas" w:hAnsi="Consolas" w:eastAsia="Consolas" w:cs="Consolas"/>
+                <w:sz w:val="15"/>
+              </w:rPr>
+              <w:t>[TBD]</w:t>
+            </w:r>
+          </w:p>
+        </w:tc>
+      </w:tr>
+      <w:tr>
+        <w:tc>
+          <w:tcPr>
+            <w:tcW w:type="dxa" w:w="1692"/>
+            <w:vAlign w:val="center"/>
+          </w:tcPr>
+          <w:p>
+            <w:pPr>
+              <w:spacing w:after="0" w:line="240" w:lineRule="auto"/>
+            </w:pPr>
+            <w:r/>
+            <w:r>
+              <w:rPr>
+                <w:rFonts w:ascii="Calibri" w:hAnsi="Calibri" w:eastAsia="SimSun" w:cs="Calibri"/>
+                <w:sz w:val="15"/>
+              </w:rPr>
               <w:t>VF MSI-X table size</w:t>
             </w:r>
           </w:p>
@@ -16496,10 +16810,10 @@
             <w:r/>
             <w:r>
               <w:rPr>
-                <w:rFonts w:ascii="Calibri" w:hAnsi="Calibri" w:eastAsia="SimSun" w:cs="Calibri"/>
-                <w:sz w:val="15"/>
-              </w:rPr>
-              <w:t>3</w:t>
+                <w:rFonts w:ascii="Consolas" w:hAnsi="Consolas" w:eastAsia="Consolas" w:cs="Consolas"/>
+                <w:sz w:val="15"/>
+              </w:rPr>
+              <w:t>[TBD]</w:t>
             </w:r>
           </w:p>
         </w:tc>
@@ -16515,10 +16829,10 @@
             <w:r/>
             <w:r>
               <w:rPr>
-                <w:rFonts w:ascii="Calibri" w:hAnsi="Calibri" w:eastAsia="SimSun" w:cs="Calibri"/>
-                <w:sz w:val="15"/>
-              </w:rPr>
-              <w:t>1</w:t>
+                <w:rFonts w:ascii="Consolas" w:hAnsi="Consolas" w:eastAsia="Consolas" w:cs="Consolas"/>
+                <w:sz w:val="15"/>
+              </w:rPr>
+              <w:t>[TBD]</w:t>
             </w:r>
           </w:p>
         </w:tc>
@@ -16534,10 +16848,10 @@
             <w:r/>
             <w:r>
               <w:rPr>
-                <w:rFonts w:ascii="Calibri" w:hAnsi="Calibri" w:eastAsia="SimSun" w:cs="Calibri"/>
-                <w:sz w:val="15"/>
-              </w:rPr>
-              <w:t>1</w:t>
+                <w:rFonts w:ascii="Consolas" w:hAnsi="Consolas" w:eastAsia="Consolas" w:cs="Consolas"/>
+                <w:sz w:val="15"/>
+              </w:rPr>
+              <w:t>[TBD]</w:t>
             </w:r>
           </w:p>
         </w:tc>
@@ -16556,7 +16870,253 @@
                 <w:rFonts w:ascii="Calibri" w:hAnsi="Calibri" w:eastAsia="SimSun" w:cs="Calibri"/>
                 <w:sz w:val="15"/>
               </w:rPr>
-              <w:t xml:space="preserve">字段值为每 VF entry 数 - 1；CoreConsultant 参数名为 </w:t>
+              <w:t xml:space="preserve">VF MSI-X entry 数由 VF interrupt vector 规划决定；CoreConsultant 参数名为 </w:t>
+            </w:r>
+            <w:r>
+              <w:rPr>
+                <w:rFonts w:ascii="Consolas" w:hAnsi="Consolas" w:eastAsia="Consolas" w:cs="Consolas"/>
+                <w:sz w:val="15"/>
+              </w:rPr>
+              <w:t>[TBD]</w:t>
+            </w:r>
+          </w:p>
+        </w:tc>
+      </w:tr>
+      <w:tr>
+        <w:tc>
+          <w:tcPr>
+            <w:tcW w:type="dxa" w:w="1692"/>
+            <w:vAlign w:val="center"/>
+          </w:tcPr>
+          <w:p>
+            <w:pPr>
+              <w:spacing w:after="0" w:line="240" w:lineRule="auto"/>
+            </w:pPr>
+            <w:r/>
+            <w:r>
+              <w:rPr>
+                <w:rFonts w:ascii="Calibri" w:hAnsi="Calibri" w:eastAsia="SimSun" w:cs="Calibri"/>
+                <w:sz w:val="15"/>
+              </w:rPr>
+              <w:t>TLP Prefix</w:t>
+            </w:r>
+          </w:p>
+        </w:tc>
+        <w:tc>
+          <w:tcPr>
+            <w:tcW w:type="dxa" w:w="3214"/>
+            <w:vAlign w:val="center"/>
+          </w:tcPr>
+          <w:p>
+            <w:pPr>
+              <w:spacing w:after="0" w:line="240" w:lineRule="auto"/>
+            </w:pPr>
+            <w:r/>
+            <w:r>
+              <w:rPr>
+                <w:rFonts w:ascii="Consolas" w:hAnsi="Consolas" w:eastAsia="Consolas" w:cs="Consolas"/>
+                <w:sz w:val="15"/>
+              </w:rPr>
+              <w:t>[TBD]</w:t>
+            </w:r>
+          </w:p>
+        </w:tc>
+        <w:tc>
+          <w:tcPr>
+            <w:tcW w:type="dxa" w:w="1692"/>
+            <w:vAlign w:val="center"/>
+          </w:tcPr>
+          <w:p>
+            <w:pPr>
+              <w:spacing w:after="0" w:line="240" w:lineRule="auto"/>
+            </w:pPr>
+            <w:r/>
+            <w:r>
+              <w:rPr>
+                <w:rFonts w:ascii="Calibri" w:hAnsi="Calibri" w:eastAsia="SimSun" w:cs="Calibri"/>
+                <w:sz w:val="15"/>
+              </w:rPr>
+              <w:t>0</w:t>
+            </w:r>
+          </w:p>
+        </w:tc>
+        <w:tc>
+          <w:tcPr>
+            <w:tcW w:type="dxa" w:w="1692"/>
+            <w:vAlign w:val="center"/>
+          </w:tcPr>
+          <w:p>
+            <w:pPr>
+              <w:spacing w:after="0" w:line="240" w:lineRule="auto"/>
+            </w:pPr>
+            <w:r/>
+            <w:r>
+              <w:rPr>
+                <w:rFonts w:ascii="Calibri" w:hAnsi="Calibri" w:eastAsia="SimSun" w:cs="Calibri"/>
+                <w:sz w:val="15"/>
+              </w:rPr>
+              <w:t>0</w:t>
+            </w:r>
+          </w:p>
+        </w:tc>
+        <w:tc>
+          <w:tcPr>
+            <w:tcW w:type="dxa" w:w="1692"/>
+            <w:vAlign w:val="center"/>
+          </w:tcPr>
+          <w:p>
+            <w:pPr>
+              <w:spacing w:after="0" w:line="240" w:lineRule="auto"/>
+            </w:pPr>
+            <w:r/>
+            <w:r>
+              <w:rPr>
+                <w:rFonts w:ascii="Calibri" w:hAnsi="Calibri" w:eastAsia="SimSun" w:cs="Calibri"/>
+                <w:sz w:val="15"/>
+              </w:rPr>
+              <w:t>0</w:t>
+            </w:r>
+          </w:p>
+        </w:tc>
+        <w:tc>
+          <w:tcPr>
+            <w:tcW w:type="dxa" w:w="3554"/>
+            <w:vAlign w:val="center"/>
+          </w:tcPr>
+          <w:p>
+            <w:pPr>
+              <w:spacing w:after="0" w:line="240" w:lineRule="auto"/>
+            </w:pPr>
+            <w:r/>
+            <w:r>
+              <w:rPr>
+                <w:rFonts w:ascii="Calibri" w:hAnsi="Calibri" w:eastAsia="SimSun" w:cs="Calibri"/>
+                <w:sz w:val="15"/>
+              </w:rPr>
+              <w:t xml:space="preserve">不支持 TLP Prefix；具体 CoreConsultant 参数名为 </w:t>
+            </w:r>
+            <w:r>
+              <w:rPr>
+                <w:rFonts w:ascii="Consolas" w:hAnsi="Consolas" w:eastAsia="Consolas" w:cs="Consolas"/>
+                <w:sz w:val="15"/>
+              </w:rPr>
+              <w:t>[TBD]</w:t>
+            </w:r>
+          </w:p>
+        </w:tc>
+      </w:tr>
+      <w:tr>
+        <w:tc>
+          <w:tcPr>
+            <w:tcW w:type="dxa" w:w="1692"/>
+            <w:vAlign w:val="center"/>
+          </w:tcPr>
+          <w:p>
+            <w:pPr>
+              <w:spacing w:after="0" w:line="240" w:lineRule="auto"/>
+            </w:pPr>
+            <w:r/>
+            <w:r>
+              <w:rPr>
+                <w:rFonts w:ascii="Calibri" w:hAnsi="Calibri" w:eastAsia="SimSun" w:cs="Calibri"/>
+                <w:sz w:val="15"/>
+              </w:rPr>
+              <w:t>TPH requester</w:t>
+            </w:r>
+          </w:p>
+        </w:tc>
+        <w:tc>
+          <w:tcPr>
+            <w:tcW w:type="dxa" w:w="3214"/>
+            <w:vAlign w:val="center"/>
+          </w:tcPr>
+          <w:p>
+            <w:pPr>
+              <w:spacing w:after="0" w:line="240" w:lineRule="auto"/>
+            </w:pPr>
+            <w:r/>
+            <w:r>
+              <w:rPr>
+                <w:rFonts w:ascii="Consolas" w:hAnsi="Consolas" w:eastAsia="Consolas" w:cs="Consolas"/>
+                <w:sz w:val="15"/>
+              </w:rPr>
+              <w:t>[TBD]</w:t>
+            </w:r>
+          </w:p>
+        </w:tc>
+        <w:tc>
+          <w:tcPr>
+            <w:tcW w:type="dxa" w:w="1692"/>
+            <w:vAlign w:val="center"/>
+          </w:tcPr>
+          <w:p>
+            <w:pPr>
+              <w:spacing w:after="0" w:line="240" w:lineRule="auto"/>
+            </w:pPr>
+            <w:r/>
+            <w:r>
+              <w:rPr>
+                <w:rFonts w:ascii="Calibri" w:hAnsi="Calibri" w:eastAsia="SimSun" w:cs="Calibri"/>
+                <w:sz w:val="15"/>
+              </w:rPr>
+              <w:t>0</w:t>
+            </w:r>
+          </w:p>
+        </w:tc>
+        <w:tc>
+          <w:tcPr>
+            <w:tcW w:type="dxa" w:w="1692"/>
+            <w:vAlign w:val="center"/>
+          </w:tcPr>
+          <w:p>
+            <w:pPr>
+              <w:spacing w:after="0" w:line="240" w:lineRule="auto"/>
+            </w:pPr>
+            <w:r/>
+            <w:r>
+              <w:rPr>
+                <w:rFonts w:ascii="Calibri" w:hAnsi="Calibri" w:eastAsia="SimSun" w:cs="Calibri"/>
+                <w:sz w:val="15"/>
+              </w:rPr>
+              <w:t>0</w:t>
+            </w:r>
+          </w:p>
+        </w:tc>
+        <w:tc>
+          <w:tcPr>
+            <w:tcW w:type="dxa" w:w="1692"/>
+            <w:vAlign w:val="center"/>
+          </w:tcPr>
+          <w:p>
+            <w:pPr>
+              <w:spacing w:after="0" w:line="240" w:lineRule="auto"/>
+            </w:pPr>
+            <w:r/>
+            <w:r>
+              <w:rPr>
+                <w:rFonts w:ascii="Calibri" w:hAnsi="Calibri" w:eastAsia="SimSun" w:cs="Calibri"/>
+                <w:sz w:val="15"/>
+              </w:rPr>
+              <w:t>0</w:t>
+            </w:r>
+          </w:p>
+        </w:tc>
+        <w:tc>
+          <w:tcPr>
+            <w:tcW w:type="dxa" w:w="3554"/>
+            <w:vAlign w:val="center"/>
+          </w:tcPr>
+          <w:p>
+            <w:pPr>
+              <w:spacing w:after="0" w:line="240" w:lineRule="auto"/>
+            </w:pPr>
+            <w:r/>
+            <w:r>
+              <w:rPr>
+                <w:rFonts w:ascii="Calibri" w:hAnsi="Calibri" w:eastAsia="SimSun" w:cs="Calibri"/>
+                <w:sz w:val="15"/>
+              </w:rPr>
+              <w:t xml:space="preserve">不支持 TPH；具体 CoreConsultant 参数名为 </w:t>
             </w:r>
             <w:r>
               <w:rPr>
@@ -20945,6 +21505,315 @@
                 <w:sz w:val="15"/>
               </w:rPr>
               <w:t>重构表 11，分列列出 Posted/Non-Posted/Completion 的 Header/Data credit 校核目标，并明确 HDMA read data 与 HDMA write data 使用不同 credit pool</w:t>
+            </w:r>
+          </w:p>
+        </w:tc>
+      </w:tr>
+      <w:tr>
+        <w:tc>
+          <w:tcPr>
+            <w:tcW w:type="dxa" w:w="3301"/>
+            <w:vAlign w:val="center"/>
+          </w:tcPr>
+          <w:p>
+            <w:pPr>
+              <w:spacing w:after="0" w:line="240" w:lineRule="auto"/>
+            </w:pPr>
+            <w:r/>
+            <w:r>
+              <w:rPr>
+                <w:rFonts w:ascii="Calibri" w:hAnsi="Calibri" w:eastAsia="SimSun" w:cs="Calibri"/>
+                <w:sz w:val="15"/>
+              </w:rPr>
+              <w:t>1.30</w:t>
+            </w:r>
+          </w:p>
+        </w:tc>
+        <w:tc>
+          <w:tcPr>
+            <w:tcW w:type="dxa" w:w="3301"/>
+            <w:vAlign w:val="center"/>
+          </w:tcPr>
+          <w:p>
+            <w:pPr>
+              <w:spacing w:after="0" w:line="240" w:lineRule="auto"/>
+            </w:pPr>
+            <w:r/>
+            <w:r>
+              <w:rPr>
+                <w:rFonts w:ascii="Calibri" w:hAnsi="Calibri" w:eastAsia="SimSun" w:cs="Calibri"/>
+                <w:sz w:val="15"/>
+              </w:rPr>
+              <w:t>2026-07-22</w:t>
+            </w:r>
+          </w:p>
+        </w:tc>
+        <w:tc>
+          <w:tcPr>
+            <w:tcW w:type="dxa" w:w="6934"/>
+            <w:vAlign w:val="center"/>
+          </w:tcPr>
+          <w:p>
+            <w:pPr>
+              <w:spacing w:after="0" w:line="240" w:lineRule="auto"/>
+            </w:pPr>
+            <w:r/>
+            <w:r>
+              <w:rPr>
+                <w:rFonts w:ascii="Calibri" w:hAnsi="Calibri" w:eastAsia="SimSun" w:cs="Calibri"/>
+                <w:sz w:val="15"/>
+              </w:rPr>
+              <w:t>明确不支持 TLP Prefix 及其相关 ATS/PASID/PRS/TPH 功能；澄清 SR-IOV 与 MSI/MSI-X capability 的关系</w:t>
+            </w:r>
+          </w:p>
+        </w:tc>
+      </w:tr>
+      <w:tr>
+        <w:tc>
+          <w:tcPr>
+            <w:tcW w:type="dxa" w:w="3301"/>
+            <w:vAlign w:val="center"/>
+          </w:tcPr>
+          <w:p>
+            <w:pPr>
+              <w:spacing w:after="0" w:line="240" w:lineRule="auto"/>
+            </w:pPr>
+            <w:r/>
+            <w:r>
+              <w:rPr>
+                <w:rFonts w:ascii="Calibri" w:hAnsi="Calibri" w:eastAsia="SimSun" w:cs="Calibri"/>
+                <w:sz w:val="15"/>
+              </w:rPr>
+              <w:t>1.31</w:t>
+            </w:r>
+          </w:p>
+        </w:tc>
+        <w:tc>
+          <w:tcPr>
+            <w:tcW w:type="dxa" w:w="3301"/>
+            <w:vAlign w:val="center"/>
+          </w:tcPr>
+          <w:p>
+            <w:pPr>
+              <w:spacing w:after="0" w:line="240" w:lineRule="auto"/>
+            </w:pPr>
+            <w:r/>
+            <w:r>
+              <w:rPr>
+                <w:rFonts w:ascii="Calibri" w:hAnsi="Calibri" w:eastAsia="SimSun" w:cs="Calibri"/>
+                <w:sz w:val="15"/>
+              </w:rPr>
+              <w:t>2026-07-22</w:t>
+            </w:r>
+          </w:p>
+        </w:tc>
+        <w:tc>
+          <w:tcPr>
+            <w:tcW w:type="dxa" w:w="6934"/>
+            <w:vAlign w:val="center"/>
+          </w:tcPr>
+          <w:p>
+            <w:pPr>
+              <w:spacing w:after="0" w:line="240" w:lineRule="auto"/>
+            </w:pPr>
+            <w:r/>
+            <w:r>
+              <w:rPr>
+                <w:rFonts w:ascii="Calibri" w:hAnsi="Calibri" w:eastAsia="SimSun" w:cs="Calibri"/>
+                <w:sz w:val="15"/>
+              </w:rPr>
+              <w:t>将 PF/VF interrupt mode 调整为待定；保留 SR-IOV 启用时 MSI 或 MSI-X capability 至少启用一种的约束，不再将 MSI-X 作为已选定配置</w:t>
+            </w:r>
+          </w:p>
+        </w:tc>
+      </w:tr>
+      <w:tr>
+        <w:tc>
+          <w:tcPr>
+            <w:tcW w:type="dxa" w:w="3301"/>
+            <w:vAlign w:val="center"/>
+          </w:tcPr>
+          <w:p>
+            <w:pPr>
+              <w:spacing w:after="0" w:line="240" w:lineRule="auto"/>
+            </w:pPr>
+            <w:r/>
+            <w:r>
+              <w:rPr>
+                <w:rFonts w:ascii="Calibri" w:hAnsi="Calibri" w:eastAsia="SimSun" w:cs="Calibri"/>
+                <w:sz w:val="15"/>
+              </w:rPr>
+              <w:t>1.32</w:t>
+            </w:r>
+          </w:p>
+        </w:tc>
+        <w:tc>
+          <w:tcPr>
+            <w:tcW w:type="dxa" w:w="3301"/>
+            <w:vAlign w:val="center"/>
+          </w:tcPr>
+          <w:p>
+            <w:pPr>
+              <w:spacing w:after="0" w:line="240" w:lineRule="auto"/>
+            </w:pPr>
+            <w:r/>
+            <w:r>
+              <w:rPr>
+                <w:rFonts w:ascii="Calibri" w:hAnsi="Calibri" w:eastAsia="SimSun" w:cs="Calibri"/>
+                <w:sz w:val="15"/>
+              </w:rPr>
+              <w:t>2026-07-22</w:t>
+            </w:r>
+          </w:p>
+        </w:tc>
+        <w:tc>
+          <w:tcPr>
+            <w:tcW w:type="dxa" w:w="6934"/>
+            <w:vAlign w:val="center"/>
+          </w:tcPr>
+          <w:p>
+            <w:pPr>
+              <w:spacing w:after="0" w:line="240" w:lineRule="auto"/>
+            </w:pPr>
+            <w:r/>
+            <w:r>
+              <w:rPr>
+                <w:rFonts w:ascii="Calibri" w:hAnsi="Calibri" w:eastAsia="SimSun" w:cs="Calibri"/>
+                <w:sz w:val="15"/>
+              </w:rPr>
+              <w:t xml:space="preserve">补充 </w:t>
+            </w:r>
+            <w:r>
+              <w:rPr>
+                <w:rFonts w:ascii="Consolas" w:hAnsi="Consolas" w:eastAsia="Consolas" w:cs="Consolas"/>
+                <w:sz w:val="15"/>
+              </w:rPr>
+              <w:t>VF_MSI_CAP_ENABLE</w:t>
+            </w:r>
+            <w:r>
+              <w:rPr>
+                <w:rFonts w:ascii="Calibri" w:hAnsi="Calibri" w:eastAsia="SimSun" w:cs="Calibri"/>
+                <w:sz w:val="15"/>
+              </w:rPr>
+              <w:t>，明确 VF MSI 与 VF MSI-X capability 具备独立配置开关；PF/VF interrupt mode 仍保持待定</w:t>
+            </w:r>
+          </w:p>
+        </w:tc>
+      </w:tr>
+      <w:tr>
+        <w:tc>
+          <w:tcPr>
+            <w:tcW w:type="dxa" w:w="3301"/>
+            <w:vAlign w:val="center"/>
+          </w:tcPr>
+          <w:p>
+            <w:pPr>
+              <w:spacing w:after="0" w:line="240" w:lineRule="auto"/>
+            </w:pPr>
+            <w:r/>
+            <w:r>
+              <w:rPr>
+                <w:rFonts w:ascii="Calibri" w:hAnsi="Calibri" w:eastAsia="SimSun" w:cs="Calibri"/>
+                <w:sz w:val="15"/>
+              </w:rPr>
+              <w:t>1.33</w:t>
+            </w:r>
+          </w:p>
+        </w:tc>
+        <w:tc>
+          <w:tcPr>
+            <w:tcW w:type="dxa" w:w="3301"/>
+            <w:vAlign w:val="center"/>
+          </w:tcPr>
+          <w:p>
+            <w:pPr>
+              <w:spacing w:after="0" w:line="240" w:lineRule="auto"/>
+            </w:pPr>
+            <w:r/>
+            <w:r>
+              <w:rPr>
+                <w:rFonts w:ascii="Calibri" w:hAnsi="Calibri" w:eastAsia="SimSun" w:cs="Calibri"/>
+                <w:sz w:val="15"/>
+              </w:rPr>
+              <w:t>2026-07-22</w:t>
+            </w:r>
+          </w:p>
+        </w:tc>
+        <w:tc>
+          <w:tcPr>
+            <w:tcW w:type="dxa" w:w="6934"/>
+            <w:vAlign w:val="center"/>
+          </w:tcPr>
+          <w:p>
+            <w:pPr>
+              <w:spacing w:after="0" w:line="240" w:lineRule="auto"/>
+            </w:pPr>
+            <w:r/>
+            <w:r>
+              <w:rPr>
+                <w:rFonts w:ascii="Calibri" w:hAnsi="Calibri" w:eastAsia="SimSun" w:cs="Calibri"/>
+                <w:sz w:val="15"/>
+              </w:rPr>
+              <w:t>明确 PF 支持 MSI 和 MSI-X，VF 支持 MSI，VF 是否支持 MSI-X 保持待定</w:t>
+            </w:r>
+          </w:p>
+        </w:tc>
+      </w:tr>
+      <w:tr>
+        <w:tc>
+          <w:tcPr>
+            <w:tcW w:type="dxa" w:w="3301"/>
+            <w:vAlign w:val="center"/>
+          </w:tcPr>
+          <w:p>
+            <w:pPr>
+              <w:spacing w:after="0" w:line="240" w:lineRule="auto"/>
+            </w:pPr>
+            <w:r/>
+            <w:r>
+              <w:rPr>
+                <w:rFonts w:ascii="Calibri" w:hAnsi="Calibri" w:eastAsia="SimSun" w:cs="Calibri"/>
+                <w:sz w:val="15"/>
+              </w:rPr>
+              <w:t>1.34</w:t>
+            </w:r>
+          </w:p>
+        </w:tc>
+        <w:tc>
+          <w:tcPr>
+            <w:tcW w:type="dxa" w:w="3301"/>
+            <w:vAlign w:val="center"/>
+          </w:tcPr>
+          <w:p>
+            <w:pPr>
+              <w:spacing w:after="0" w:line="240" w:lineRule="auto"/>
+            </w:pPr>
+            <w:r/>
+            <w:r>
+              <w:rPr>
+                <w:rFonts w:ascii="Calibri" w:hAnsi="Calibri" w:eastAsia="SimSun" w:cs="Calibri"/>
+                <w:sz w:val="15"/>
+              </w:rPr>
+              <w:t>2026-07-22</w:t>
+            </w:r>
+          </w:p>
+        </w:tc>
+        <w:tc>
+          <w:tcPr>
+            <w:tcW w:type="dxa" w:w="6934"/>
+            <w:vAlign w:val="center"/>
+          </w:tcPr>
+          <w:p>
+            <w:pPr>
+              <w:spacing w:after="0" w:line="240" w:lineRule="auto"/>
+            </w:pPr>
+            <w:r/>
+            <w:r>
+              <w:rPr>
+                <w:rFonts w:ascii="Calibri" w:hAnsi="Calibri" w:eastAsia="SimSun" w:cs="Calibri"/>
+                <w:sz w:val="15"/>
+              </w:rPr>
+              <w:t>简化 Feature List 中 ATS/PASID/PRS/TLP Prefix/TPH 表述，统一为不支持</w:t>
             </w:r>
           </w:p>
         </w:tc>

</xml_diff>